<commit_message>
TEST V1 SCROLL ANIMATION
</commit_message>
<xml_diff>
--- a/public/assets/texte site.docx
+++ b/public/assets/texte site.docx
@@ -127,6 +127,12 @@
       </w:r>
       <w:r>
         <w:t xml:space="preserve">Nous ne croyons pas au théâtre didactique. </w:t>
+      </w:r>
+    </w:p>
+    <w:p/>
+    <w:p>
+      <w:r>
+        <w:t>[…]</w:t>
       </w:r>
     </w:p>
     <w:p/>
@@ -1046,11 +1052,11 @@
       <w:rFonts w:ascii="Garamond" w:hAnsi="Garamond"/>
     </w:rPr>
   </w:style>
-  <w:style w:type="paragraph" w:styleId="Titre1">
+  <w:style w:type="paragraph" w:styleId="Heading1">
     <w:name w:val="heading 1"/>
     <w:basedOn w:val="Normal"/>
     <w:next w:val="Normal"/>
-    <w:link w:val="Titre1Car"/>
+    <w:link w:val="Heading1Char"/>
     <w:uiPriority w:val="9"/>
     <w:qFormat/>
     <w:rsid w:val="001D5020"/>
@@ -1069,11 +1075,11 @@
       <w:szCs w:val="40"/>
     </w:rPr>
   </w:style>
-  <w:style w:type="paragraph" w:styleId="Titre2">
+  <w:style w:type="paragraph" w:styleId="Heading2">
     <w:name w:val="heading 2"/>
     <w:basedOn w:val="Normal"/>
     <w:next w:val="Normal"/>
-    <w:link w:val="Titre2Car"/>
+    <w:link w:val="Heading2Char"/>
     <w:uiPriority w:val="9"/>
     <w:unhideWhenUsed/>
     <w:qFormat/>
@@ -1091,11 +1097,11 @@
       <w:szCs w:val="32"/>
     </w:rPr>
   </w:style>
-  <w:style w:type="paragraph" w:styleId="Titre3">
+  <w:style w:type="paragraph" w:styleId="Heading3">
     <w:name w:val="heading 3"/>
     <w:basedOn w:val="Normal"/>
     <w:next w:val="Normal"/>
-    <w:link w:val="Titre3Car"/>
+    <w:link w:val="Heading3Char"/>
     <w:uiPriority w:val="9"/>
     <w:unhideWhenUsed/>
     <w:qFormat/>
@@ -1114,11 +1120,11 @@
       <w:szCs w:val="28"/>
     </w:rPr>
   </w:style>
-  <w:style w:type="paragraph" w:styleId="Titre4">
+  <w:style w:type="paragraph" w:styleId="Heading4">
     <w:name w:val="heading 4"/>
     <w:basedOn w:val="Normal"/>
     <w:next w:val="Normal"/>
-    <w:link w:val="Titre4Car"/>
+    <w:link w:val="Heading4Char"/>
     <w:uiPriority w:val="9"/>
     <w:semiHidden/>
     <w:unhideWhenUsed/>
@@ -1138,11 +1144,11 @@
       <w:u w:val="single"/>
     </w:rPr>
   </w:style>
-  <w:style w:type="paragraph" w:styleId="Titre5">
+  <w:style w:type="paragraph" w:styleId="Heading5">
     <w:name w:val="heading 5"/>
     <w:basedOn w:val="Normal"/>
     <w:next w:val="Normal"/>
-    <w:link w:val="Titre5Car"/>
+    <w:link w:val="Heading5Char"/>
     <w:uiPriority w:val="9"/>
     <w:semiHidden/>
     <w:unhideWhenUsed/>
@@ -1159,11 +1165,11 @@
       <w:color w:val="0F4761" w:themeColor="accent1" w:themeShade="BF"/>
     </w:rPr>
   </w:style>
-  <w:style w:type="paragraph" w:styleId="Titre6">
+  <w:style w:type="paragraph" w:styleId="Heading6">
     <w:name w:val="heading 6"/>
     <w:basedOn w:val="Normal"/>
     <w:next w:val="Normal"/>
-    <w:link w:val="Titre6Car"/>
+    <w:link w:val="Heading6Char"/>
     <w:uiPriority w:val="9"/>
     <w:semiHidden/>
     <w:unhideWhenUsed/>
@@ -1182,11 +1188,11 @@
       <w:color w:val="595959" w:themeColor="text1" w:themeTint="A6"/>
     </w:rPr>
   </w:style>
-  <w:style w:type="paragraph" w:styleId="Titre7">
+  <w:style w:type="paragraph" w:styleId="Heading7">
     <w:name w:val="heading 7"/>
     <w:basedOn w:val="Normal"/>
     <w:next w:val="Normal"/>
-    <w:link w:val="Titre7Car"/>
+    <w:link w:val="Heading7Char"/>
     <w:uiPriority w:val="9"/>
     <w:semiHidden/>
     <w:unhideWhenUsed/>
@@ -1203,11 +1209,11 @@
       <w:color w:val="595959" w:themeColor="text1" w:themeTint="A6"/>
     </w:rPr>
   </w:style>
-  <w:style w:type="paragraph" w:styleId="Titre8">
+  <w:style w:type="paragraph" w:styleId="Heading8">
     <w:name w:val="heading 8"/>
     <w:basedOn w:val="Normal"/>
     <w:next w:val="Normal"/>
-    <w:link w:val="Titre8Car"/>
+    <w:link w:val="Heading8Char"/>
     <w:uiPriority w:val="9"/>
     <w:semiHidden/>
     <w:unhideWhenUsed/>
@@ -1225,11 +1231,11 @@
       <w:color w:val="272727" w:themeColor="text1" w:themeTint="D8"/>
     </w:rPr>
   </w:style>
-  <w:style w:type="paragraph" w:styleId="Titre9">
+  <w:style w:type="paragraph" w:styleId="Heading9">
     <w:name w:val="heading 9"/>
     <w:basedOn w:val="Normal"/>
     <w:next w:val="Normal"/>
-    <w:link w:val="Titre9Car"/>
+    <w:link w:val="Heading9Char"/>
     <w:uiPriority w:val="9"/>
     <w:semiHidden/>
     <w:unhideWhenUsed/>
@@ -1245,13 +1251,13 @@
       <w:color w:val="272727" w:themeColor="text1" w:themeTint="D8"/>
     </w:rPr>
   </w:style>
-  <w:style w:type="character" w:default="1" w:styleId="Policepardfaut">
+  <w:style w:type="character" w:default="1" w:styleId="DefaultParagraphFont">
     <w:name w:val="Default Paragraph Font"/>
     <w:uiPriority w:val="1"/>
     <w:semiHidden/>
     <w:unhideWhenUsed/>
   </w:style>
-  <w:style w:type="table" w:default="1" w:styleId="TableauNormal">
+  <w:style w:type="table" w:default="1" w:styleId="TableNormal">
     <w:name w:val="Normal Table"/>
     <w:uiPriority w:val="99"/>
     <w:semiHidden/>
@@ -1266,16 +1272,16 @@
       </w:tblCellMar>
     </w:tblPr>
   </w:style>
-  <w:style w:type="numbering" w:default="1" w:styleId="Aucuneliste">
+  <w:style w:type="numbering" w:default="1" w:styleId="NoList">
     <w:name w:val="No List"/>
     <w:uiPriority w:val="99"/>
     <w:semiHidden/>
     <w:unhideWhenUsed/>
   </w:style>
-  <w:style w:type="character" w:customStyle="1" w:styleId="Titre1Car">
-    <w:name w:val="Titre 1 Car"/>
-    <w:basedOn w:val="Policepardfaut"/>
-    <w:link w:val="Titre1"/>
+  <w:style w:type="character" w:customStyle="1" w:styleId="Heading1Char">
+    <w:name w:val="Heading 1 Char"/>
+    <w:basedOn w:val="DefaultParagraphFont"/>
+    <w:link w:val="Heading1"/>
     <w:uiPriority w:val="9"/>
     <w:rsid w:val="001D5020"/>
     <w:rPr>
@@ -1286,10 +1292,10 @@
       <w:szCs w:val="40"/>
     </w:rPr>
   </w:style>
-  <w:style w:type="character" w:customStyle="1" w:styleId="Titre2Car">
-    <w:name w:val="Titre 2 Car"/>
-    <w:basedOn w:val="Policepardfaut"/>
-    <w:link w:val="Titre2"/>
+  <w:style w:type="character" w:customStyle="1" w:styleId="Heading2Char">
+    <w:name w:val="Heading 2 Char"/>
+    <w:basedOn w:val="DefaultParagraphFont"/>
+    <w:link w:val="Heading2"/>
     <w:uiPriority w:val="9"/>
     <w:rsid w:val="001D5020"/>
     <w:rPr>
@@ -1299,10 +1305,10 @@
       <w:szCs w:val="32"/>
     </w:rPr>
   </w:style>
-  <w:style w:type="character" w:customStyle="1" w:styleId="Titre3Car">
-    <w:name w:val="Titre 3 Car"/>
-    <w:basedOn w:val="Policepardfaut"/>
-    <w:link w:val="Titre3"/>
+  <w:style w:type="character" w:customStyle="1" w:styleId="Heading3Char">
+    <w:name w:val="Heading 3 Char"/>
+    <w:basedOn w:val="DefaultParagraphFont"/>
+    <w:link w:val="Heading3"/>
     <w:uiPriority w:val="9"/>
     <w:rsid w:val="001D5020"/>
     <w:rPr>
@@ -1313,10 +1319,10 @@
       <w:szCs w:val="28"/>
     </w:rPr>
   </w:style>
-  <w:style w:type="character" w:customStyle="1" w:styleId="Titre4Car">
-    <w:name w:val="Titre 4 Car"/>
-    <w:basedOn w:val="Policepardfaut"/>
-    <w:link w:val="Titre4"/>
+  <w:style w:type="character" w:customStyle="1" w:styleId="Heading4Char">
+    <w:name w:val="Heading 4 Char"/>
+    <w:basedOn w:val="DefaultParagraphFont"/>
+    <w:link w:val="Heading4"/>
     <w:uiPriority w:val="9"/>
     <w:semiHidden/>
     <w:rsid w:val="001D5020"/>
@@ -1328,11 +1334,11 @@
       <w:u w:val="single"/>
     </w:rPr>
   </w:style>
-  <w:style w:type="paragraph" w:styleId="Citation">
+  <w:style w:type="paragraph" w:styleId="Quote">
     <w:name w:val="Quote"/>
     <w:basedOn w:val="Normal"/>
     <w:next w:val="Normal"/>
-    <w:link w:val="CitationCar"/>
+    <w:link w:val="QuoteChar"/>
     <w:uiPriority w:val="29"/>
     <w:qFormat/>
     <w:rsid w:val="001D5020"/>
@@ -1352,10 +1358,10 @@
       <w:sz w:val="20"/>
     </w:rPr>
   </w:style>
-  <w:style w:type="character" w:customStyle="1" w:styleId="CitationCar">
-    <w:name w:val="Citation Car"/>
-    <w:basedOn w:val="Policepardfaut"/>
-    <w:link w:val="Citation"/>
+  <w:style w:type="character" w:customStyle="1" w:styleId="QuoteChar">
+    <w:name w:val="Quote Char"/>
+    <w:basedOn w:val="DefaultParagraphFont"/>
+    <w:link w:val="Quote"/>
     <w:uiPriority w:val="29"/>
     <w:rsid w:val="001D5020"/>
     <w:rPr>
@@ -1365,10 +1371,10 @@
       <w:sz w:val="20"/>
     </w:rPr>
   </w:style>
-  <w:style w:type="character" w:customStyle="1" w:styleId="Titre5Car">
-    <w:name w:val="Titre 5 Car"/>
-    <w:basedOn w:val="Policepardfaut"/>
-    <w:link w:val="Titre5"/>
+  <w:style w:type="character" w:customStyle="1" w:styleId="Heading5Char">
+    <w:name w:val="Heading 5 Char"/>
+    <w:basedOn w:val="DefaultParagraphFont"/>
+    <w:link w:val="Heading5"/>
     <w:uiPriority w:val="9"/>
     <w:semiHidden/>
     <w:rsid w:val="00B328DF"/>
@@ -1377,10 +1383,10 @@
       <w:color w:val="0F4761" w:themeColor="accent1" w:themeShade="BF"/>
     </w:rPr>
   </w:style>
-  <w:style w:type="character" w:customStyle="1" w:styleId="Titre6Car">
-    <w:name w:val="Titre 6 Car"/>
-    <w:basedOn w:val="Policepardfaut"/>
-    <w:link w:val="Titre6"/>
+  <w:style w:type="character" w:customStyle="1" w:styleId="Heading6Char">
+    <w:name w:val="Heading 6 Char"/>
+    <w:basedOn w:val="DefaultParagraphFont"/>
+    <w:link w:val="Heading6"/>
     <w:uiPriority w:val="9"/>
     <w:semiHidden/>
     <w:rsid w:val="00B328DF"/>
@@ -1391,10 +1397,10 @@
       <w:color w:val="595959" w:themeColor="text1" w:themeTint="A6"/>
     </w:rPr>
   </w:style>
-  <w:style w:type="character" w:customStyle="1" w:styleId="Titre7Car">
-    <w:name w:val="Titre 7 Car"/>
-    <w:basedOn w:val="Policepardfaut"/>
-    <w:link w:val="Titre7"/>
+  <w:style w:type="character" w:customStyle="1" w:styleId="Heading7Char">
+    <w:name w:val="Heading 7 Char"/>
+    <w:basedOn w:val="DefaultParagraphFont"/>
+    <w:link w:val="Heading7"/>
     <w:uiPriority w:val="9"/>
     <w:semiHidden/>
     <w:rsid w:val="00B328DF"/>
@@ -1403,10 +1409,10 @@
       <w:color w:val="595959" w:themeColor="text1" w:themeTint="A6"/>
     </w:rPr>
   </w:style>
-  <w:style w:type="character" w:customStyle="1" w:styleId="Titre8Car">
-    <w:name w:val="Titre 8 Car"/>
-    <w:basedOn w:val="Policepardfaut"/>
-    <w:link w:val="Titre8"/>
+  <w:style w:type="character" w:customStyle="1" w:styleId="Heading8Char">
+    <w:name w:val="Heading 8 Char"/>
+    <w:basedOn w:val="DefaultParagraphFont"/>
+    <w:link w:val="Heading8"/>
     <w:uiPriority w:val="9"/>
     <w:semiHidden/>
     <w:rsid w:val="00B328DF"/>
@@ -1417,10 +1423,10 @@
       <w:color w:val="272727" w:themeColor="text1" w:themeTint="D8"/>
     </w:rPr>
   </w:style>
-  <w:style w:type="character" w:customStyle="1" w:styleId="Titre9Car">
-    <w:name w:val="Titre 9 Car"/>
-    <w:basedOn w:val="Policepardfaut"/>
-    <w:link w:val="Titre9"/>
+  <w:style w:type="character" w:customStyle="1" w:styleId="Heading9Char">
+    <w:name w:val="Heading 9 Char"/>
+    <w:basedOn w:val="DefaultParagraphFont"/>
+    <w:link w:val="Heading9"/>
     <w:uiPriority w:val="9"/>
     <w:semiHidden/>
     <w:rsid w:val="00B328DF"/>
@@ -1429,11 +1435,11 @@
       <w:color w:val="272727" w:themeColor="text1" w:themeTint="D8"/>
     </w:rPr>
   </w:style>
-  <w:style w:type="paragraph" w:styleId="Titre">
+  <w:style w:type="paragraph" w:styleId="Title">
     <w:name w:val="Title"/>
     <w:basedOn w:val="Normal"/>
     <w:next w:val="Normal"/>
-    <w:link w:val="TitreCar"/>
+    <w:link w:val="TitleChar"/>
     <w:uiPriority w:val="10"/>
     <w:qFormat/>
     <w:rsid w:val="00B328DF"/>
@@ -1449,10 +1455,10 @@
       <w:szCs w:val="56"/>
     </w:rPr>
   </w:style>
-  <w:style w:type="character" w:customStyle="1" w:styleId="TitreCar">
-    <w:name w:val="Titre Car"/>
-    <w:basedOn w:val="Policepardfaut"/>
-    <w:link w:val="Titre"/>
+  <w:style w:type="character" w:customStyle="1" w:styleId="TitleChar">
+    <w:name w:val="Title Char"/>
+    <w:basedOn w:val="DefaultParagraphFont"/>
+    <w:link w:val="Title"/>
     <w:uiPriority w:val="10"/>
     <w:rsid w:val="00B328DF"/>
     <w:rPr>
@@ -1463,11 +1469,11 @@
       <w:szCs w:val="56"/>
     </w:rPr>
   </w:style>
-  <w:style w:type="paragraph" w:styleId="Sous-titre">
+  <w:style w:type="paragraph" w:styleId="Subtitle">
     <w:name w:val="Subtitle"/>
     <w:basedOn w:val="Normal"/>
     <w:next w:val="Normal"/>
-    <w:link w:val="Sous-titreCar"/>
+    <w:link w:val="SubtitleChar"/>
     <w:uiPriority w:val="11"/>
     <w:qFormat/>
     <w:rsid w:val="00B328DF"/>
@@ -1485,10 +1491,10 @@
       <w:szCs w:val="28"/>
     </w:rPr>
   </w:style>
-  <w:style w:type="character" w:customStyle="1" w:styleId="Sous-titreCar">
-    <w:name w:val="Sous-titre Car"/>
-    <w:basedOn w:val="Policepardfaut"/>
-    <w:link w:val="Sous-titre"/>
+  <w:style w:type="character" w:customStyle="1" w:styleId="SubtitleChar">
+    <w:name w:val="Subtitle Char"/>
+    <w:basedOn w:val="DefaultParagraphFont"/>
+    <w:link w:val="Subtitle"/>
     <w:uiPriority w:val="11"/>
     <w:rsid w:val="00B328DF"/>
     <w:rPr>
@@ -1499,7 +1505,7 @@
       <w:szCs w:val="28"/>
     </w:rPr>
   </w:style>
-  <w:style w:type="paragraph" w:styleId="Paragraphedeliste">
+  <w:style w:type="paragraph" w:styleId="ListParagraph">
     <w:name w:val="List Paragraph"/>
     <w:basedOn w:val="Normal"/>
     <w:uiPriority w:val="34"/>
@@ -1510,9 +1516,9 @@
       <w:contextualSpacing/>
     </w:pPr>
   </w:style>
-  <w:style w:type="character" w:styleId="Accentuationintense">
+  <w:style w:type="character" w:styleId="IntenseEmphasis">
     <w:name w:val="Intense Emphasis"/>
-    <w:basedOn w:val="Policepardfaut"/>
+    <w:basedOn w:val="DefaultParagraphFont"/>
     <w:uiPriority w:val="21"/>
     <w:qFormat/>
     <w:rsid w:val="00B328DF"/>
@@ -1522,11 +1528,11 @@
       <w:color w:val="0F4761" w:themeColor="accent1" w:themeShade="BF"/>
     </w:rPr>
   </w:style>
-  <w:style w:type="paragraph" w:styleId="Citationintense">
+  <w:style w:type="paragraph" w:styleId="IntenseQuote">
     <w:name w:val="Intense Quote"/>
     <w:basedOn w:val="Normal"/>
     <w:next w:val="Normal"/>
-    <w:link w:val="CitationintenseCar"/>
+    <w:link w:val="IntenseQuoteChar"/>
     <w:uiPriority w:val="30"/>
     <w:qFormat/>
     <w:rsid w:val="00B328DF"/>
@@ -1545,10 +1551,10 @@
       <w:color w:val="0F4761" w:themeColor="accent1" w:themeShade="BF"/>
     </w:rPr>
   </w:style>
-  <w:style w:type="character" w:customStyle="1" w:styleId="CitationintenseCar">
-    <w:name w:val="Citation intense Car"/>
-    <w:basedOn w:val="Policepardfaut"/>
-    <w:link w:val="Citationintense"/>
+  <w:style w:type="character" w:customStyle="1" w:styleId="IntenseQuoteChar">
+    <w:name w:val="Intense Quote Char"/>
+    <w:basedOn w:val="DefaultParagraphFont"/>
+    <w:link w:val="IntenseQuote"/>
     <w:uiPriority w:val="30"/>
     <w:rsid w:val="00B328DF"/>
     <w:rPr>
@@ -1558,9 +1564,9 @@
       <w:color w:val="0F4761" w:themeColor="accent1" w:themeShade="BF"/>
     </w:rPr>
   </w:style>
-  <w:style w:type="character" w:styleId="Rfrenceintense">
+  <w:style w:type="character" w:styleId="IntenseReference">
     <w:name w:val="Intense Reference"/>
-    <w:basedOn w:val="Policepardfaut"/>
+    <w:basedOn w:val="DefaultParagraphFont"/>
     <w:uiPriority w:val="32"/>
     <w:qFormat/>
     <w:rsid w:val="00B328DF"/>

</xml_diff>